<commit_message>
Preparação Inicial da Introdução 1.v
</commit_message>
<xml_diff>
--- a/Introducao_PI.docx
+++ b/Introducao_PI.docx
@@ -27,8 +27,8 @@
         <w:spacing w:line="360" w:lineRule="auto"/>
         <w:jc w:val="both"/>
         <w:rPr>
-          <w:sz w:val="24"/>
-          <w:szCs w:val="24"/>
+          <w:rFonts w:ascii="Arial" w:hAnsi="Arial" w:cs="Arial"/>
+          <w:sz w:val="24"/>
         </w:rPr>
       </w:pPr>
     </w:p>
@@ -46,35 +46,158 @@
           <w:rFonts w:ascii="Arial" w:hAnsi="Arial" w:cs="Arial"/>
           <w:sz w:val="24"/>
         </w:rPr>
-        <w:t xml:space="preserve">Empresa </w:t>
-      </w:r>
-      <w:r>
-        <w:rPr>
-          <w:rFonts w:ascii="Arial" w:hAnsi="Arial" w:cs="Arial"/>
-          <w:sz w:val="24"/>
-        </w:rPr>
-        <w:t>referência</w:t>
-      </w:r>
-      <w:r>
-        <w:rPr>
-          <w:rFonts w:ascii="Arial" w:hAnsi="Arial" w:cs="Arial"/>
-          <w:sz w:val="24"/>
-        </w:rPr>
-        <w:t xml:space="preserve"> no ramo da saúde fundad</w:t>
-      </w:r>
-      <w:r>
-        <w:rPr>
-          <w:rFonts w:ascii="Arial" w:hAnsi="Arial" w:cs="Arial"/>
-          <w:sz w:val="24"/>
-        </w:rPr>
-        <w:t>a</w:t>
-      </w:r>
-      <w:r>
-        <w:rPr>
-          <w:rFonts w:ascii="Arial" w:hAnsi="Arial" w:cs="Arial"/>
-          <w:sz w:val="24"/>
-        </w:rPr>
-        <w:t xml:space="preserve"> na cidade de São Paulo, a qual possui unidade na cidade de Brasília. Fundada por um grupo de senhoras imigrantes libanesas</w:t>
+        <w:t>A</w:t>
+      </w:r>
+      <w:r>
+        <w:rPr>
+          <w:rFonts w:ascii="Arial" w:hAnsi="Arial" w:cs="Arial"/>
+          <w:sz w:val="24"/>
+        </w:rPr>
+        <w:t xml:space="preserve"> instituição Sírio Libanês </w:t>
+      </w:r>
+      <w:r>
+        <w:rPr>
+          <w:rFonts w:ascii="Arial" w:hAnsi="Arial" w:cs="Arial"/>
+          <w:sz w:val="24"/>
+        </w:rPr>
+        <w:t>é um centro de</w:t>
+      </w:r>
+      <w:r>
+        <w:rPr>
+          <w:rFonts w:ascii="Arial" w:hAnsi="Arial" w:cs="Arial"/>
+          <w:sz w:val="24"/>
+        </w:rPr>
+        <w:t xml:space="preserve"> referência</w:t>
+      </w:r>
+      <w:r>
+        <w:rPr>
+          <w:rFonts w:ascii="Arial" w:hAnsi="Arial" w:cs="Arial"/>
+          <w:sz w:val="24"/>
+        </w:rPr>
+        <w:t xml:space="preserve"> em at</w:t>
+      </w:r>
+      <w:bookmarkStart w:id="0" w:name="_GoBack"/>
+      <w:bookmarkEnd w:id="0"/>
+      <w:r>
+        <w:rPr>
+          <w:rFonts w:ascii="Arial" w:hAnsi="Arial" w:cs="Arial"/>
+          <w:sz w:val="24"/>
+        </w:rPr>
+        <w:t>endimento médico especializado</w:t>
+      </w:r>
+      <w:r>
+        <w:rPr>
+          <w:rFonts w:ascii="Arial" w:hAnsi="Arial" w:cs="Arial"/>
+          <w:sz w:val="24"/>
+        </w:rPr>
+        <w:t xml:space="preserve"> no Brasil e </w:t>
+      </w:r>
+      <w:r>
+        <w:rPr>
+          <w:rFonts w:ascii="Arial" w:hAnsi="Arial" w:cs="Arial"/>
+          <w:sz w:val="24"/>
+        </w:rPr>
+        <w:t xml:space="preserve">na </w:t>
+      </w:r>
+      <w:r>
+        <w:rPr>
+          <w:rFonts w:ascii="Arial" w:hAnsi="Arial" w:cs="Arial"/>
+          <w:sz w:val="24"/>
+        </w:rPr>
+        <w:t>América Latina</w:t>
+      </w:r>
+      <w:r>
+        <w:rPr>
+          <w:rFonts w:ascii="Arial" w:hAnsi="Arial" w:cs="Arial"/>
+          <w:sz w:val="24"/>
+        </w:rPr>
+        <w:t>. É reconhecid</w:t>
+      </w:r>
+      <w:r>
+        <w:rPr>
+          <w:rFonts w:ascii="Arial" w:hAnsi="Arial" w:cs="Arial"/>
+          <w:sz w:val="24"/>
+        </w:rPr>
+        <w:t>a pela sua capacidade tecnológica e sua excelência assistencial</w:t>
+      </w:r>
+      <w:r>
+        <w:rPr>
+          <w:rFonts w:ascii="Arial" w:hAnsi="Arial" w:cs="Arial"/>
+          <w:sz w:val="24"/>
+        </w:rPr>
+        <w:t xml:space="preserve">. Além </w:t>
+      </w:r>
+      <w:proofErr w:type="gramStart"/>
+      <w:r>
+        <w:rPr>
+          <w:rFonts w:ascii="Arial" w:hAnsi="Arial" w:cs="Arial"/>
+          <w:sz w:val="24"/>
+        </w:rPr>
+        <w:t>disso,</w:t>
+      </w:r>
+      <w:r>
+        <w:rPr>
+          <w:rFonts w:ascii="Arial" w:hAnsi="Arial" w:cs="Arial"/>
+          <w:sz w:val="24"/>
+        </w:rPr>
+        <w:t xml:space="preserve"> </w:t>
+      </w:r>
+      <w:r>
+        <w:rPr>
+          <w:rFonts w:ascii="Arial" w:hAnsi="Arial" w:cs="Arial"/>
+          <w:sz w:val="24"/>
+        </w:rPr>
+        <w:t xml:space="preserve"> </w:t>
+      </w:r>
+      <w:r>
+        <w:rPr>
+          <w:rFonts w:ascii="Arial" w:hAnsi="Arial" w:cs="Arial"/>
+          <w:sz w:val="24"/>
+        </w:rPr>
+        <w:t>e</w:t>
+      </w:r>
+      <w:proofErr w:type="gramEnd"/>
+      <w:r>
+        <w:rPr>
+          <w:rFonts w:ascii="Arial" w:hAnsi="Arial" w:cs="Arial"/>
+          <w:sz w:val="24"/>
+        </w:rPr>
+        <w:t xml:space="preserve"> pela </w:t>
+      </w:r>
+      <w:r>
+        <w:rPr>
+          <w:rFonts w:ascii="Arial" w:hAnsi="Arial" w:cs="Arial"/>
+          <w:sz w:val="24"/>
+        </w:rPr>
+        <w:t xml:space="preserve">busca </w:t>
+      </w:r>
+      <w:r>
+        <w:rPr>
+          <w:rFonts w:ascii="Arial" w:hAnsi="Arial" w:cs="Arial"/>
+          <w:sz w:val="24"/>
+        </w:rPr>
+        <w:t>constante em</w:t>
+      </w:r>
+      <w:r>
+        <w:rPr>
+          <w:rFonts w:ascii="Arial" w:hAnsi="Arial" w:cs="Arial"/>
+          <w:sz w:val="24"/>
+        </w:rPr>
+        <w:t xml:space="preserve"> inovação nos procedimentos médicos a qual ela atua</w:t>
+      </w:r>
+      <w:r>
+        <w:rPr>
+          <w:rFonts w:ascii="Arial" w:hAnsi="Arial" w:cs="Arial"/>
+          <w:sz w:val="24"/>
+        </w:rPr>
+        <w:t xml:space="preserve">. </w:t>
+      </w:r>
+      <w:r>
+        <w:rPr>
+          <w:rFonts w:ascii="Arial" w:hAnsi="Arial" w:cs="Arial"/>
+          <w:sz w:val="24"/>
+        </w:rPr>
+        <w:t>Fundada por um grupo de senhoras imigrantes libanesas</w:t>
       </w:r>
       <w:r>
         <w:rPr>
@@ -88,70 +211,7 @@
           <w:rFonts w:ascii="Arial" w:hAnsi="Arial" w:cs="Arial"/>
           <w:sz w:val="24"/>
         </w:rPr>
-        <w:t xml:space="preserve"> que com o intuito de retribuição</w:t>
-      </w:r>
-      <w:r>
-        <w:rPr>
-          <w:rFonts w:ascii="Arial" w:hAnsi="Arial" w:cs="Arial"/>
-          <w:sz w:val="24"/>
-        </w:rPr>
-        <w:t xml:space="preserve"> </w:t>
-      </w:r>
-      <w:r>
-        <w:rPr>
-          <w:rFonts w:ascii="Arial" w:hAnsi="Arial" w:cs="Arial"/>
-          <w:sz w:val="24"/>
-        </w:rPr>
-        <w:t xml:space="preserve">não apenas a cidade de São Paulo, mas a nação brasileira que </w:t>
-      </w:r>
-      <w:r>
-        <w:rPr>
-          <w:rFonts w:ascii="Arial" w:hAnsi="Arial" w:cs="Arial"/>
-          <w:sz w:val="24"/>
-        </w:rPr>
-        <w:t xml:space="preserve">as </w:t>
-      </w:r>
-      <w:r>
-        <w:rPr>
-          <w:rFonts w:ascii="Arial" w:hAnsi="Arial" w:cs="Arial"/>
-          <w:sz w:val="24"/>
-        </w:rPr>
-        <w:t xml:space="preserve">acolheu, retribuir </w:t>
-      </w:r>
-      <w:r>
-        <w:rPr>
-          <w:rFonts w:ascii="Arial" w:hAnsi="Arial" w:cs="Arial"/>
-          <w:sz w:val="24"/>
-        </w:rPr>
-        <w:t xml:space="preserve">com </w:t>
-      </w:r>
-      <w:r>
-        <w:rPr>
-          <w:rFonts w:ascii="Arial" w:hAnsi="Arial" w:cs="Arial"/>
-          <w:sz w:val="24"/>
-        </w:rPr>
-        <w:t>atendimento</w:t>
-      </w:r>
-      <w:r>
-        <w:rPr>
-          <w:rFonts w:ascii="Arial" w:hAnsi="Arial" w:cs="Arial"/>
-          <w:sz w:val="24"/>
-        </w:rPr>
-        <w:t xml:space="preserve"> hospitalar</w:t>
-      </w:r>
-      <w:r>
-        <w:rPr>
-          <w:rFonts w:ascii="Arial" w:hAnsi="Arial" w:cs="Arial"/>
-          <w:sz w:val="24"/>
-        </w:rPr>
-        <w:t xml:space="preserve"> </w:t>
-      </w:r>
-      <w:r>
-        <w:rPr>
-          <w:rFonts w:ascii="Arial" w:hAnsi="Arial" w:cs="Arial"/>
-          <w:sz w:val="24"/>
-        </w:rPr>
-        <w:t>de qualidade.</w:t>
+        <w:t xml:space="preserve"> que com o intuito de retribuição não apenas a cidade de São Paulo, mas a nação brasileira que as acolheu, retribuir com atendimento hospitalar de qualidade.</w:t>
       </w:r>
     </w:p>
     <w:p>
@@ -163,97 +223,6 @@
           <w:sz w:val="24"/>
         </w:rPr>
       </w:pPr>
-      <w:r>
-        <w:rPr>
-          <w:rFonts w:ascii="Arial" w:hAnsi="Arial" w:cs="Arial"/>
-          <w:sz w:val="24"/>
-        </w:rPr>
-        <w:t xml:space="preserve">Atualmente a instituição Sírio Libanês é referência no Brasil e </w:t>
-      </w:r>
-      <w:r>
-        <w:rPr>
-          <w:rFonts w:ascii="Arial" w:hAnsi="Arial" w:cs="Arial"/>
-          <w:sz w:val="24"/>
-        </w:rPr>
-        <w:t>A</w:t>
-      </w:r>
-      <w:r>
-        <w:rPr>
-          <w:rFonts w:ascii="Arial" w:hAnsi="Arial" w:cs="Arial"/>
-          <w:sz w:val="24"/>
-        </w:rPr>
-        <w:t xml:space="preserve">mérica </w:t>
-      </w:r>
-      <w:r>
-        <w:rPr>
-          <w:rFonts w:ascii="Arial" w:hAnsi="Arial" w:cs="Arial"/>
-          <w:sz w:val="24"/>
-        </w:rPr>
-        <w:t>La</w:t>
-      </w:r>
-      <w:r>
-        <w:rPr>
-          <w:rFonts w:ascii="Arial" w:hAnsi="Arial" w:cs="Arial"/>
-          <w:sz w:val="24"/>
-        </w:rPr>
-        <w:t xml:space="preserve">tina, e busca trazer inovação nos procedimentos médicos a qual ela atua. </w:t>
-      </w:r>
-      <w:r>
-        <w:rPr>
-          <w:rFonts w:ascii="Arial" w:hAnsi="Arial" w:cs="Arial"/>
-          <w:sz w:val="24"/>
-        </w:rPr>
-        <w:t>Uma i</w:t>
-      </w:r>
-      <w:r>
-        <w:rPr>
-          <w:rFonts w:ascii="Arial" w:hAnsi="Arial" w:cs="Arial"/>
-          <w:sz w:val="24"/>
-        </w:rPr>
-        <w:t>nstituição composta por corpo médico altamente qualificado</w:t>
-      </w:r>
-      <w:r>
-        <w:rPr>
-          <w:rFonts w:ascii="Arial" w:hAnsi="Arial" w:cs="Arial"/>
-          <w:sz w:val="24"/>
-        </w:rPr>
-        <w:t>, d</w:t>
-      </w:r>
-      <w:r>
-        <w:rPr>
-          <w:rFonts w:ascii="Arial" w:hAnsi="Arial" w:cs="Arial"/>
-          <w:sz w:val="24"/>
-        </w:rPr>
-        <w:t>estaca</w:t>
-      </w:r>
-      <w:r>
-        <w:rPr>
-          <w:rFonts w:ascii="Arial" w:hAnsi="Arial" w:cs="Arial"/>
-          <w:sz w:val="24"/>
-        </w:rPr>
-        <w:t>ndo</w:t>
-      </w:r>
-      <w:r>
-        <w:rPr>
-          <w:rFonts w:ascii="Arial" w:hAnsi="Arial" w:cs="Arial"/>
-          <w:sz w:val="24"/>
-        </w:rPr>
-        <w:t>-se por sua excelência tecnológica, sua humanização em atendimentos e gestão de alta complexidade</w:t>
-      </w:r>
-      <w:r>
-        <w:rPr>
-          <w:rFonts w:ascii="Arial" w:hAnsi="Arial" w:cs="Arial"/>
-          <w:sz w:val="24"/>
-        </w:rPr>
-        <w:t>, porém, a instituição não se limita apenas ao atendimento hospitalar</w:t>
-      </w:r>
-      <w:r>
-        <w:rPr>
-          <w:rFonts w:ascii="Arial" w:hAnsi="Arial" w:cs="Arial"/>
-          <w:sz w:val="24"/>
-        </w:rPr>
-        <w:t>, possuindo uma faculdade para amplo desenvolvimento acadêmico, profissionalização de seus colaboradores e desenvolvimento cientifico.</w:t>
-      </w:r>
     </w:p>
     <w:p>
       <w:pPr>
@@ -269,14 +238,126 @@
           <w:rFonts w:ascii="Arial" w:hAnsi="Arial" w:cs="Arial"/>
           <w:sz w:val="24"/>
         </w:rPr>
-        <w:t>O grupo optou pelo hospital Sírio-libanês por sua identificação com os ideais do Sírio que compõe um propósito de vida plena e digna, uma visão de excelência em filantropia e saúde de alta complexidade e seus valores em solidariedade, excelência e resultado</w:t>
-      </w:r>
-      <w:r>
-        <w:rPr>
-          <w:rFonts w:ascii="Arial" w:hAnsi="Arial" w:cs="Arial"/>
-          <w:sz w:val="24"/>
-        </w:rPr>
-        <w:t>.</w:t>
+        <w:t xml:space="preserve">Empresa </w:t>
+      </w:r>
+      <w:r>
+        <w:rPr>
+          <w:rFonts w:ascii="Arial" w:hAnsi="Arial" w:cs="Arial"/>
+          <w:sz w:val="24"/>
+        </w:rPr>
+        <w:t>referência</w:t>
+      </w:r>
+      <w:r>
+        <w:rPr>
+          <w:rFonts w:ascii="Arial" w:hAnsi="Arial" w:cs="Arial"/>
+          <w:sz w:val="24"/>
+        </w:rPr>
+        <w:t xml:space="preserve"> no ramo da saúde fundad</w:t>
+      </w:r>
+      <w:r>
+        <w:rPr>
+          <w:rFonts w:ascii="Arial" w:hAnsi="Arial" w:cs="Arial"/>
+          <w:sz w:val="24"/>
+        </w:rPr>
+        <w:t>a</w:t>
+      </w:r>
+      <w:r>
+        <w:rPr>
+          <w:rFonts w:ascii="Arial" w:hAnsi="Arial" w:cs="Arial"/>
+          <w:sz w:val="24"/>
+        </w:rPr>
+        <w:t xml:space="preserve"> na cidade de São Paulo, a qual possui unidade na cidade de Brasília. </w:t>
+      </w:r>
+      <w:r>
+        <w:rPr>
+          <w:rFonts w:ascii="Arial" w:hAnsi="Arial" w:cs="Arial"/>
+          <w:sz w:val="24"/>
+        </w:rPr>
+        <w:t xml:space="preserve">Atualmente a instituição Sírio Libanês é referência no Brasil e </w:t>
+      </w:r>
+      <w:r>
+        <w:rPr>
+          <w:rFonts w:ascii="Arial" w:hAnsi="Arial" w:cs="Arial"/>
+          <w:sz w:val="24"/>
+        </w:rPr>
+        <w:t>A</w:t>
+      </w:r>
+      <w:r>
+        <w:rPr>
+          <w:rFonts w:ascii="Arial" w:hAnsi="Arial" w:cs="Arial"/>
+          <w:sz w:val="24"/>
+        </w:rPr>
+        <w:t xml:space="preserve">mérica </w:t>
+      </w:r>
+      <w:r>
+        <w:rPr>
+          <w:rFonts w:ascii="Arial" w:hAnsi="Arial" w:cs="Arial"/>
+          <w:sz w:val="24"/>
+        </w:rPr>
+        <w:t>La</w:t>
+      </w:r>
+      <w:r>
+        <w:rPr>
+          <w:rFonts w:ascii="Arial" w:hAnsi="Arial" w:cs="Arial"/>
+          <w:sz w:val="24"/>
+        </w:rPr>
+        <w:t xml:space="preserve">tina, e busca trazer inovação nos procedimentos médicos a qual ela atua. </w:t>
+      </w:r>
+      <w:r>
+        <w:rPr>
+          <w:rFonts w:ascii="Arial" w:hAnsi="Arial" w:cs="Arial"/>
+          <w:sz w:val="24"/>
+        </w:rPr>
+        <w:t>Uma i</w:t>
+      </w:r>
+      <w:r>
+        <w:rPr>
+          <w:rFonts w:ascii="Arial" w:hAnsi="Arial" w:cs="Arial"/>
+          <w:sz w:val="24"/>
+        </w:rPr>
+        <w:t>nstituição composta por corpo médico altamente qualificado</w:t>
+      </w:r>
+      <w:r>
+        <w:rPr>
+          <w:rFonts w:ascii="Arial" w:hAnsi="Arial" w:cs="Arial"/>
+          <w:sz w:val="24"/>
+        </w:rPr>
+        <w:t>, d</w:t>
+      </w:r>
+      <w:r>
+        <w:rPr>
+          <w:rFonts w:ascii="Arial" w:hAnsi="Arial" w:cs="Arial"/>
+          <w:sz w:val="24"/>
+        </w:rPr>
+        <w:t>estaca</w:t>
+      </w:r>
+      <w:r>
+        <w:rPr>
+          <w:rFonts w:ascii="Arial" w:hAnsi="Arial" w:cs="Arial"/>
+          <w:sz w:val="24"/>
+        </w:rPr>
+        <w:t>ndo</w:t>
+      </w:r>
+      <w:r>
+        <w:rPr>
+          <w:rFonts w:ascii="Arial" w:hAnsi="Arial" w:cs="Arial"/>
+          <w:sz w:val="24"/>
+        </w:rPr>
+        <w:t>-se por sua excelência tecnológica, sua humanização em atendimentos e gestão de alta complexidade</w:t>
+      </w:r>
+      <w:r>
+        <w:rPr>
+          <w:rFonts w:ascii="Arial" w:hAnsi="Arial" w:cs="Arial"/>
+          <w:sz w:val="24"/>
+        </w:rPr>
+        <w:t>, porém, a instituição não se limita apenas ao atendimento hospitalar</w:t>
+      </w:r>
+      <w:r>
+        <w:rPr>
+          <w:rFonts w:ascii="Arial" w:hAnsi="Arial" w:cs="Arial"/>
+          <w:sz w:val="24"/>
+        </w:rPr>
+        <w:t>, possuindo uma faculdade para amplo desenvolvimento acadêmico, profissionalização de seus colaboradores e desenvolvimento cientifico.</w:t>
       </w:r>
     </w:p>
     <w:p>
@@ -288,8 +369,30 @@
           <w:sz w:val="24"/>
         </w:rPr>
       </w:pPr>
-      <w:bookmarkStart w:id="0" w:name="_GoBack"/>
-      <w:bookmarkEnd w:id="0"/>
+      <w:r>
+        <w:rPr>
+          <w:rFonts w:ascii="Arial" w:hAnsi="Arial" w:cs="Arial"/>
+          <w:sz w:val="24"/>
+        </w:rPr>
+        <w:t>O grupo optou pelo hospital Sírio-libanês por sua identificação com os ideais do Sírio que compõe um propósito de vida plena e digna, uma visão de excelência em filantropia e saúde de alta complexidade e seus valores em solidariedade, excelência e resultado</w:t>
+      </w:r>
+      <w:r>
+        <w:rPr>
+          <w:rFonts w:ascii="Arial" w:hAnsi="Arial" w:cs="Arial"/>
+          <w:sz w:val="24"/>
+        </w:rPr>
+        <w:t>.</w:t>
+      </w:r>
+    </w:p>
+    <w:p>
+      <w:pPr>
+        <w:spacing w:line="360" w:lineRule="auto"/>
+        <w:jc w:val="both"/>
+        <w:rPr>
+          <w:rFonts w:ascii="Arial" w:hAnsi="Arial" w:cs="Arial"/>
+          <w:sz w:val="24"/>
+        </w:rPr>
+      </w:pPr>
     </w:p>
     <w:p>
       <w:pPr>

</xml_diff>